<commit_message>
feat(09-03): extend export_service + DOCX template with DRF linkages
- export_service._build_context() now returns drf_linkages + is_dnd_position
  (drf_linkages filtered to confirmed linkages on DND positions only)
- build_version_manifest() emits a ProvenanceTag per confirmed DRF linkage
  (source_type='DRF', source_version='DND DRF Dataset 2021-2022')
- scripts/build_docx_template.py adds Section 6 (DRF Linkages) gated by
  is_dnd_position; table-row for/data/endfor pattern matches JES/manifest
- build script self-asserts drf_linkages + is_dnd_position are declared
- Regenerated DOCX (37KB) verified: 14 declared template variables including
  the two new DRF ones; render smoke test against _build_context output
  produces non-empty bytes (37426)
</commit_message>
<xml_diff>
--- a/templates/docx/work_description_template.docx
+++ b/templates/docx/work_description_template.docx
@@ -612,6 +612,162 @@
         </w:tc>
       </w:tr>
     </w:tbl>
+    <w:p>
+      <w:r>
+        <w:t>{%p if is_dnd_position %}</w:t>
+      </w:r>
+    </w:p>
+    <w:p>
+      <w:pPr>
+        <w:pStyle w:val="Heading1"/>
+      </w:pPr>
+      <w:r>
+        <w:t>6. Departmental Results Framework Linkages</w:t>
+      </w:r>
+    </w:p>
+    <w:p>
+      <w:r>
+        <w:t>The following DRF programs and expected results are linked to the duties of this position (DND positions only).</w:t>
+      </w:r>
+    </w:p>
+    <w:tbl>
+      <w:tblPr>
+        <w:tblStyle w:val="LightGrid-Accent1"/>
+        <w:tblW w:type="auto" w:w="0"/>
+        <w:tblLook w:firstColumn="1" w:firstRow="1" w:lastColumn="0" w:lastRow="0" w:noHBand="0" w:noVBand="1" w:val="04A0"/>
+      </w:tblPr>
+      <w:tblGrid>
+        <w:gridCol w:w="2880"/>
+        <w:gridCol w:w="2880"/>
+        <w:gridCol w:w="2880"/>
+      </w:tblGrid>
+      <w:tr>
+        <w:tc>
+          <w:tcPr>
+            <w:tcW w:type="dxa" w:w="2880"/>
+          </w:tcPr>
+          <w:p>
+            <w:r>
+              <w:rPr>
+                <w:b/>
+              </w:rPr>
+              <w:t>Core Responsibility</w:t>
+            </w:r>
+          </w:p>
+        </w:tc>
+        <w:tc>
+          <w:tcPr>
+            <w:tcW w:type="dxa" w:w="2880"/>
+          </w:tcPr>
+          <w:p>
+            <w:r>
+              <w:rPr>
+                <w:b/>
+              </w:rPr>
+              <w:t>Departmental Result</w:t>
+            </w:r>
+          </w:p>
+        </w:tc>
+        <w:tc>
+          <w:tcPr>
+            <w:tcW w:type="dxa" w:w="2880"/>
+          </w:tcPr>
+          <w:p>
+            <w:r>
+              <w:rPr>
+                <w:b/>
+              </w:rPr>
+              <w:t>Fiscal Year</w:t>
+            </w:r>
+          </w:p>
+        </w:tc>
+      </w:tr>
+      <w:tr>
+        <w:tc>
+          <w:tcPr>
+            <w:tcW w:type="dxa" w:w="2880"/>
+          </w:tcPr>
+          <w:p>
+            <w:r>
+              <w:t>{%tr for link in drf_linkages %}</w:t>
+            </w:r>
+          </w:p>
+        </w:tc>
+        <w:tc>
+          <w:tcPr>
+            <w:tcW w:type="dxa" w:w="2880"/>
+          </w:tcPr>
+          <w:p/>
+        </w:tc>
+        <w:tc>
+          <w:tcPr>
+            <w:tcW w:type="dxa" w:w="2880"/>
+          </w:tcPr>
+          <w:p/>
+        </w:tc>
+      </w:tr>
+      <w:tr>
+        <w:tc>
+          <w:tcPr>
+            <w:tcW w:type="dxa" w:w="2880"/>
+          </w:tcPr>
+          <w:p>
+            <w:r>
+              <w:t>{{ link.core_responsibility }}</w:t>
+            </w:r>
+          </w:p>
+        </w:tc>
+        <w:tc>
+          <w:tcPr>
+            <w:tcW w:type="dxa" w:w="2880"/>
+          </w:tcPr>
+          <w:p>
+            <w:r>
+              <w:t>{{ link.departmental_result }}</w:t>
+            </w:r>
+          </w:p>
+        </w:tc>
+        <w:tc>
+          <w:tcPr>
+            <w:tcW w:type="dxa" w:w="2880"/>
+          </w:tcPr>
+          <w:p>
+            <w:r>
+              <w:t>{{ link.fiscal_year }}</w:t>
+            </w:r>
+          </w:p>
+        </w:tc>
+      </w:tr>
+      <w:tr>
+        <w:tc>
+          <w:tcPr>
+            <w:tcW w:type="dxa" w:w="2880"/>
+          </w:tcPr>
+          <w:p>
+            <w:r>
+              <w:t>{%tr endfor %}</w:t>
+            </w:r>
+          </w:p>
+        </w:tc>
+        <w:tc>
+          <w:tcPr>
+            <w:tcW w:type="dxa" w:w="2880"/>
+          </w:tcPr>
+          <w:p/>
+        </w:tc>
+        <w:tc>
+          <w:tcPr>
+            <w:tcW w:type="dxa" w:w="2880"/>
+          </w:tcPr>
+          <w:p/>
+        </w:tc>
+      </w:tr>
+    </w:tbl>
+    <w:p>
+      <w:r>
+        <w:t>{%p endif %}</w:t>
+      </w:r>
+    </w:p>
     <w:sectPr>
       <w:pgSz w:w="12240" w:h="15840"/>
       <w:pgMar w:top="1440" w:right="1800" w:bottom="1440" w:left="1800" w:header="720" w:footer="720" w:gutter="0"/>

</xml_diff>